<commit_message>
📋 Plan ready for review: BARATHKUMAR R
</commit_message>
<xml_diff>
--- a/plans/pending/BARATHKUMAR_R_plan.docx
+++ b/plans/pending/BARATHKUMAR_R_plan.docx
@@ -450,7 +450,7 @@
           <w:color w:val="2C2C2C"/>
           <w:sz w:val="20"/>
         </w:rPr>
-        <w:t>Barathkumar, your current metrics of a BMI of 20.8 (Normal) and a body fat percentage of 15.0% (Fit) provide an excellent foundation for your muscle gain journey. With a lean body mass of 53.5 kg and fat mass of 9.5 kg, you are already in a strong starting position. This protocol is designed to strategically build upon your existing fitness, adding quality muscle mass while maintaining a healthy body composition. Your dedication will be key to transforming these numbers into significant strength and aesthetic gains.</w:t>
+        <w:t>Barathkumar, your current physique, with a healthy BMI of 20.8 and a fit body fat percentage of 15.0%, provides an excellent foundation for your muscle gain journey. Your lean body mass stands at 53.5 kg, with fat mass at 9.5 kg, indicating a well-balanced starting point. This means we can focus on building quality muscle mass efficiently, minimizing excessive fat gain during your caloric surplus. You're in a great position to achieve significant lean muscle development with consistent effort.</w:t>
       </w:r>
     </w:p>
     <w:p/>
@@ -642,7 +642,7 @@
           <w:color w:val="2C2C2C"/>
           <w:sz w:val="20"/>
         </w:rPr>
-        <w:t>1 bowl (70g dry) Oats cooked with water/low-fat milk, 2 whole eggs scrambled with mixed vegetables (onions, capsicum), 1 small banana.</w:t>
+        <w:t>1 cup cooked oats (approx. 80g dry) made with 200ml skim milk, 2 whole eggs + 2 egg whites (scrambled or boiled), 1 small apple.</w:t>
       </w:r>
     </w:p>
     <w:p>
@@ -663,7 +663,7 @@
           <w:color w:val="27AE60"/>
           <w:sz w:val="18"/>
         </w:rPr>
-        <w:t>2 medium Roti, 1 cup Mixed Vegetable Curry, 1 cup plain Greek Yogurt.</w:t>
+        <w:t>2 whole wheat rotis with 75g paneer bhurji, 1 cup low-fat curd.</w:t>
       </w:r>
     </w:p>
     <w:p>
@@ -677,7 +677,7 @@
           <w:color w:val="95A5A6"/>
           <w:sz w:val="18"/>
         </w:rPr>
-        <w:t>P: 25g  |  C: 65g  |  F: 10g</w:t>
+        <w:t>P: 25g  |  C: 60g  |  F: 15g</w:t>
       </w:r>
     </w:p>
     <w:p>
@@ -719,7 +719,7 @@
           <w:color w:val="2C2C2C"/>
           <w:sz w:val="20"/>
         </w:rPr>
-        <w:t>1 cup Sprouted Moong Dal Salad (with chopped cucumber, tomato, onion, lemon juice), 1 small fruit (e.g., orange).</w:t>
+        <w:t>1 medium banana, 15g mixed nuts (almonds, walnuts).</w:t>
       </w:r>
     </w:p>
     <w:p>
@@ -740,7 +740,7 @@
           <w:color w:val="27AE60"/>
           <w:sz w:val="18"/>
         </w:rPr>
-        <w:t>1 large Banana, 1 handful (30g) Roasted Peanuts.</w:t>
+        <w:t>1 cup plain Greek yogurt (low fat) with 1/2 cup mixed berries.</w:t>
       </w:r>
     </w:p>
     <w:p>
@@ -754,7 +754,7 @@
           <w:color w:val="95A5A6"/>
           <w:sz w:val="18"/>
         </w:rPr>
-        <w:t>P: 15g  |  C: 40g  |  F: 7g</w:t>
+        <w:t>P: 5g  |  C: 40g  |  F: 10g</w:t>
       </w:r>
     </w:p>
     <w:p>
@@ -796,7 +796,7 @@
           <w:color w:val="2C2C2C"/>
           <w:sz w:val="20"/>
         </w:rPr>
-        <w:t>1.5 cups (180g cooked) Brown Rice, 1 cup Dal (Tur Dal/Moong Dal), 100g Paneer Bhurji (cooked with minimal oil and spices), 1 bowl Mixed Vegetable Salad.</w:t>
+        <w:t>1.5 cups cooked brown rice, 1 cup mixed vegetable dal, 100g paneer curry or bhurji, large serving of green salad.</w:t>
       </w:r>
     </w:p>
     <w:p>
@@ -817,7 +817,7 @@
           <w:color w:val="27AE60"/>
           <w:sz w:val="18"/>
         </w:rPr>
-        <w:t>3-4 Roti, 1 cup Chana Masala, 1 cup Egg Curry (made with 2 eggs), 1 bowl plain Curd.</w:t>
+        <w:t>3 whole wheat rotis, 1 cup chana masala, 3 boiled eggs (whole), green salad.</w:t>
       </w:r>
     </w:p>
     <w:p>
@@ -831,7 +831,7 @@
           <w:color w:val="95A5A6"/>
           <w:sz w:val="18"/>
         </w:rPr>
-        <w:t>P: 30g  |  C: 90g  |  F: 15g</w:t>
+        <w:t>P: 30g  |  C: 80g  |  F: 20g</w:t>
       </w:r>
     </w:p>
     <w:p>
@@ -853,7 +853,7 @@
           <w:color w:val="2D0A6E"/>
           <w:sz w:val="22"/>
         </w:rPr>
-        <w:t xml:space="preserve">  Evening Snack (Pre-workout) (4:00 PM)</w:t>
+        <w:t xml:space="preserve">  Pre-Workout Snack (4:00 PM)</w:t>
       </w:r>
     </w:p>
     <w:p>
@@ -873,7 +873,7 @@
           <w:color w:val="2C2C2C"/>
           <w:sz w:val="20"/>
         </w:rPr>
-        <w:t>2 slices Whole Wheat Bread sandwich with 1 tbsp Peanut Butter and banana slices.</w:t>
+        <w:t>1 medium banana, 2 rice cakes.</w:t>
       </w:r>
     </w:p>
     <w:p>
@@ -894,7 +894,7 @@
           <w:color w:val="27AE60"/>
           <w:sz w:val="18"/>
         </w:rPr>
-        <w:t>1 large Sweet Potato (baked/boiled), 1 handful (20g) Dates.</w:t>
+        <w:t>1 small baked sweet potato, 50g mixed sprouts salad.</w:t>
       </w:r>
     </w:p>
     <w:p>
@@ -908,7 +908,7 @@
           <w:color w:val="95A5A6"/>
           <w:sz w:val="18"/>
         </w:rPr>
-        <w:t>P: 10g  |  C: 40g  |  F: 5g</w:t>
+        <w:t>P: 5g  |  C: 50g  |  F: 2g</w:t>
       </w:r>
     </w:p>
     <w:p>
@@ -930,7 +930,7 @@
           <w:color w:val="2D0A6E"/>
           <w:sz w:val="22"/>
         </w:rPr>
-        <w:t xml:space="preserve">  Post-Workout (6:30 PM)</w:t>
+        <w:t xml:space="preserve">  Post-Workout Shake (6:30 PM)</w:t>
       </w:r>
     </w:p>
     <w:p>
@@ -950,7 +950,7 @@
           <w:color w:val="2C2C2C"/>
           <w:sz w:val="20"/>
         </w:rPr>
-        <w:t>1 scoop Whey Protein (mixed with water), 1 large Banana.</w:t>
+        <w:t>1 scoop whey protein (approx. 25g protein), 1 medium banana blended with 100ml water or skim milk.</w:t>
       </w:r>
     </w:p>
     <w:p>
@@ -971,7 +971,7 @@
           <w:color w:val="27AE60"/>
           <w:sz w:val="18"/>
         </w:rPr>
-        <w:t>2 Hard-boiled Eggs, 1 cup cooked White Rice, 1 small cup fresh fruit juice (e.g., orange).</w:t>
+        <w:t>1 scoop plant-based protein (e.g., rice/pea protein), 2 dates.</w:t>
       </w:r>
     </w:p>
     <w:p>
@@ -985,7 +985,7 @@
           <w:color w:val="95A5A6"/>
           <w:sz w:val="18"/>
         </w:rPr>
-        <w:t>P: 25g  |  C: 45g  |  F: 5g</w:t>
+        <w:t>P: 30g  |  C: 40g  |  F: 3g</w:t>
       </w:r>
     </w:p>
     <w:p>
@@ -1027,7 +1027,7 @@
           <w:color w:val="2C2C2C"/>
           <w:sz w:val="20"/>
         </w:rPr>
-        <w:t>2 large Roti/Chapati, 1 cup Paneer Sabzi (e.g., Palak Paneer with 100g paneer), 1 cup Dal Makhani (moderate cream), 1 bowl Mixed Vegetable Salad.</w:t>
+        <w:t>3 whole wheat rotis, 2 whole egg curry + 1 egg white, 1 cup mixed vegetable curry.</w:t>
       </w:r>
     </w:p>
     <w:p>
@@ -1048,7 +1048,7 @@
           <w:color w:val="27AE60"/>
           <w:sz w:val="18"/>
         </w:rPr>
-        <w:t>1.5 cups (180g cooked) White Rice, 1 cup Egg Curry (made with 2 eggs), 1 cup Rajma, 1 bowl Green Salad.</w:t>
+        <w:t>1.5 cups quinoa or brown rice, 150g tofu bhurji, stir-fried green beans/broccoli.</w:t>
       </w:r>
     </w:p>
     <w:p>
@@ -1062,7 +1062,7 @@
           <w:color w:val="95A5A6"/>
           <w:sz w:val="18"/>
         </w:rPr>
-        <w:t>P: 25g  |  C: 90g  |  F: 25g</w:t>
+        <w:t>P: 35g  |  C: 80g  |  F: 20g</w:t>
       </w:r>
     </w:p>
     <w:p>
@@ -1104,7 +1104,7 @@
           <w:color w:val="2C2C2C"/>
           <w:sz w:val="20"/>
         </w:rPr>
-        <w:t>1 cup Full-fat Milk (200ml) with a pinch of Turmeric, 1 small handful (15g) Almonds.</w:t>
+        <w:t>150g low-fat paneer (cottage cheese) or 1 cup plain Greek yogurt, 10-15g jaggery or a teaspoon of honey.</w:t>
       </w:r>
     </w:p>
     <w:p>
@@ -1125,7 +1125,7 @@
           <w:color w:val="27AE60"/>
           <w:sz w:val="18"/>
         </w:rPr>
-        <w:t>50g Paneer cubes (plain), 1 tbsp Flaxseed Powder mixed in water.</w:t>
+        <w:t>200ml warm skim milk with a pinch of turmeric, 5 almonds.</w:t>
       </w:r>
     </w:p>
     <w:p>
@@ -1139,7 +1139,7 @@
           <w:color w:val="95A5A6"/>
           <w:sz w:val="18"/>
         </w:rPr>
-        <w:t>P: 10g  |  C: 9g  |  F: 10g</w:t>
+        <w:t>P: 10g  |  C: 20g  |  F: 7g</w:t>
       </w:r>
     </w:p>
     <w:p/>
@@ -1182,7 +1182,7 @@
                 <w:color w:val="2C2C2C"/>
                 <w:sz w:val="20"/>
               </w:rPr>
-              <w:t xml:space="preserve">  1. Prioritize protein at every meal to support muscle repair and growth, aiming for even distribution throughout the day.</w:t>
+              <w:t xml:space="preserve">  1. Ensure you consume at least 2.2 liters of water daily, especially with your desk job and increased activity, to support muscle function and overall health.</w:t>
             </w:r>
           </w:p>
           <w:p>
@@ -1191,7 +1191,7 @@
                 <w:color w:val="2C2C2C"/>
                 <w:sz w:val="20"/>
               </w:rPr>
-              <w:t xml:space="preserve">  2. Stay consistently hydrated by drinking at least 2.2L of water daily, especially around your desk job and workouts.</w:t>
+              <w:t xml:space="preserve">  2. Stick to your meal timings as consistently as possible to fuel your body regularly and manage hunger, which is crucial for muscle gain.</w:t>
             </w:r>
           </w:p>
           <w:p>
@@ -1200,7 +1200,7 @@
                 <w:color w:val="2C2C2C"/>
                 <w:sz w:val="20"/>
               </w:rPr>
-              <w:t xml:space="preserve">  3. Incorporate a variety of whole grains (brown rice, roti, oats) and complex carbohydrates to fuel your workouts and replenish glycogen stores.</w:t>
+              <w:t xml:space="preserve">  3. Prioritize cooking at home using fresh, whole ingredients to control your macros and avoid hidden fats/sugars often found in outside food.</w:t>
             </w:r>
           </w:p>
           <w:p>
@@ -1209,7 +1209,7 @@
                 <w:color w:val="2C2C2C"/>
                 <w:sz w:val="20"/>
               </w:rPr>
-              <w:t xml:space="preserve">  4. Prepare your meals in advance (meal prep) on weekends to ensure consistent adherence to your nutrition plan, especially with your desk job.</w:t>
+              <w:t xml:space="preserve">  4. Since your goal is muscle gain, focus on finishing all your meals and hitting your target macros each day, even if it feels like a lot of food initially.</w:t>
             </w:r>
           </w:p>
         </w:tc>
@@ -1227,6 +1227,19 @@
           <w:sz w:val="32"/>
         </w:rPr>
         <w:t>💪  TRAINING SPLIT</w:t>
+      </w:r>
+    </w:p>
+    <w:p>
+      <w:pPr>
+        <w:jc w:val="center"/>
+      </w:pPr>
+      <w:r>
+        <w:rPr>
+          <w:b/>
+          <w:color w:val="2980B9"/>
+          <w:sz w:val="24"/>
+        </w:rPr>
+        <w:t>Split Type: Bro Split</w:t>
       </w:r>
     </w:p>
     <w:tbl>
@@ -1259,7 +1272,7 @@
                 <w:color w:val="2980B9"/>
                 <w:sz w:val="26"/>
               </w:rPr>
-              <w:t xml:space="preserve">  Monday  —  Chest &amp; Triceps</w:t>
+              <w:t xml:space="preserve">  Monday  —  Chest  (Pectorals — all angles: flat, incline, decline)</w:t>
             </w:r>
           </w:p>
         </w:tc>
@@ -1412,7 +1425,7 @@
                 <w:color w:val="95A5A6"/>
                 <w:sz w:val="16"/>
               </w:rPr>
-              <w:t>💡 Focus on controlled movement and full range of motion.</w:t>
+              <w:t>💡 Focus on a controlled descent and powerful press, keeping elbows tucked slightly.</w:t>
             </w:r>
           </w:p>
         </w:tc>
@@ -1429,7 +1442,7 @@
                 <w:color w:val="2C2C2C"/>
                 <w:sz w:val="20"/>
               </w:rPr>
-              <w:t>4x8-12</w:t>
+              <w:t>4x8</w:t>
             </w:r>
           </w:p>
         </w:tc>
@@ -1502,7 +1515,7 @@
                 <w:color w:val="95A5A6"/>
                 <w:sz w:val="16"/>
               </w:rPr>
-              <w:t>💡 Maintain a slight arch in your lower back, chest up.</w:t>
+              <w:t>💡 Squeeze your chest at the top; use a weight where you can control the movement.</w:t>
             </w:r>
           </w:p>
         </w:tc>
@@ -1520,7 +1533,7 @@
                 <w:color w:val="2C2C2C"/>
                 <w:sz w:val="20"/>
               </w:rPr>
-              <w:t>3x10-15</w:t>
+              <w:t>4x10</w:t>
             </w:r>
           </w:p>
         </w:tc>
@@ -1538,7 +1551,7 @@
                 <w:color w:val="2C2C2C"/>
                 <w:sz w:val="20"/>
               </w:rPr>
-              <w:t>75s</w:t>
+              <w:t>90s</w:t>
             </w:r>
           </w:p>
         </w:tc>
@@ -1583,7 +1596,7 @@
                 <w:color w:val="27AE60"/>
                 <w:sz w:val="16"/>
               </w:rPr>
-              <w:t>↻ Alt: Pec Deck Fly</w:t>
+              <w:t>↻ Alt: Pec Deck Fly Machine</w:t>
             </w:r>
           </w:p>
           <w:p>
@@ -1592,7 +1605,7 @@
                 <w:color w:val="95A5A6"/>
                 <w:sz w:val="16"/>
               </w:rPr>
-              <w:t>💡 Squeeze your chest at the peak contraction.</w:t>
+              <w:t>💡 Bring hands together in front of your chest, feeling the squeeze.</w:t>
             </w:r>
           </w:p>
         </w:tc>
@@ -1609,7 +1622,7 @@
                 <w:color w:val="2C2C2C"/>
                 <w:sz w:val="20"/>
               </w:rPr>
-              <w:t>3x12-15</w:t>
+              <w:t>3x12</w:t>
             </w:r>
           </w:p>
         </w:tc>
@@ -1663,7 +1676,7 @@
                 <w:color w:val="2C2C2C"/>
                 <w:sz w:val="20"/>
               </w:rPr>
-              <w:t>Overhead Dumbbell Extension (Two-Hand)</w:t>
+              <w:t>Machine Chest Press</w:t>
             </w:r>
           </w:p>
           <w:p>
@@ -1673,7 +1686,7 @@
                 <w:color w:val="27AE60"/>
                 <w:sz w:val="16"/>
               </w:rPr>
-              <w:t>↻ Alt: Rope Overhead Triceps Extension</w:t>
+              <w:t>↻ Alt: Decline Dumbbell Press</w:t>
             </w:r>
           </w:p>
           <w:p>
@@ -1682,7 +1695,7 @@
                 <w:color w:val="95A5A6"/>
                 <w:sz w:val="16"/>
               </w:rPr>
-              <w:t>💡 Keep elbows close to your head, avoid flaring out.</w:t>
+              <w:t>💡 Great for beginners to learn pressing mechanics with stability.</w:t>
             </w:r>
           </w:p>
         </w:tc>
@@ -1700,7 +1713,7 @@
                 <w:color w:val="2C2C2C"/>
                 <w:sz w:val="20"/>
               </w:rPr>
-              <w:t>3x10-15</w:t>
+              <w:t>3x12</w:t>
             </w:r>
           </w:p>
         </w:tc>
@@ -1718,7 +1731,7 @@
                 <w:color w:val="2C2C2C"/>
                 <w:sz w:val="20"/>
               </w:rPr>
-              <w:t>75s</w:t>
+              <w:t>60s</w:t>
             </w:r>
           </w:p>
         </w:tc>
@@ -1753,7 +1766,7 @@
                 <w:color w:val="2C2C2C"/>
                 <w:sz w:val="20"/>
               </w:rPr>
-              <w:t>Triceps Pushdown (Rope Attachment)</w:t>
+              <w:t>Push-ups (Bodyweight)</w:t>
             </w:r>
           </w:p>
           <w:p>
@@ -1763,7 +1776,7 @@
                 <w:color w:val="27AE60"/>
                 <w:sz w:val="16"/>
               </w:rPr>
-              <w:t>↻ Alt: Straight Bar Triceps Pushdown</w:t>
+              <w:t>↻ Alt: Knee Push-ups (if needed) or Weighted Push-ups</w:t>
             </w:r>
           </w:p>
           <w:p>
@@ -1772,7 +1785,7 @@
                 <w:color w:val="95A5A6"/>
                 <w:sz w:val="16"/>
               </w:rPr>
-              <w:t>💡 Fully extend your arms at the bottom, squeeze triceps.</w:t>
+              <w:t>💡 Keep your core tight, chest to the floor, and push explosively.</w:t>
             </w:r>
           </w:p>
         </w:tc>
@@ -1789,7 +1802,7 @@
                 <w:color w:val="2C2C2C"/>
                 <w:sz w:val="20"/>
               </w:rPr>
-              <w:t>3x12-15</w:t>
+              <w:t>3xF (failure)</w:t>
             </w:r>
           </w:p>
         </w:tc>
@@ -1843,7 +1856,7 @@
                 <w:color w:val="2980B9"/>
                 <w:sz w:val="26"/>
               </w:rPr>
-              <w:t xml:space="preserve">  Tuesday  —  Back &amp; Biceps</w:t>
+              <w:t xml:space="preserve">  Tuesday  —  Back  (Lats, rhomboids, traps)</w:t>
             </w:r>
           </w:p>
         </w:tc>
@@ -1996,7 +2009,7 @@
                 <w:color w:val="95A5A6"/>
                 <w:sz w:val="16"/>
               </w:rPr>
-              <w:t>💡 Pull with your back, not just your arms; squeeze shoulder blades.</w:t>
+              <w:t>💡 Pull the bar to your upper chest, squeezing your shoulder blades together.</w:t>
             </w:r>
           </w:p>
         </w:tc>
@@ -2013,7 +2026,7 @@
                 <w:color w:val="2C2C2C"/>
                 <w:sz w:val="20"/>
               </w:rPr>
-              <w:t>4x8-12</w:t>
+              <w:t>4x8</w:t>
             </w:r>
           </w:p>
         </w:tc>
@@ -2067,7 +2080,7 @@
                 <w:color w:val="2C2C2C"/>
                 <w:sz w:val="20"/>
               </w:rPr>
-              <w:t>Barbell Row (Bent-Over)</w:t>
+              <w:t>Seated Cable Row</w:t>
             </w:r>
           </w:p>
           <w:p>
@@ -2077,7 +2090,7 @@
                 <w:color w:val="27AE60"/>
                 <w:sz w:val="16"/>
               </w:rPr>
-              <w:t>↻ Alt: Dumbbell Row (Single Arm)</w:t>
+              <w:t>↻ Alt: T-Bar Row Machine</w:t>
             </w:r>
           </w:p>
           <w:p>
@@ -2086,7 +2099,7 @@
                 <w:color w:val="95A5A6"/>
                 <w:sz w:val="16"/>
               </w:rPr>
-              <w:t>💡 Maintain a flat back, hinge at the hips.</w:t>
+              <w:t>💡 Lean slightly back, pull with your back muscles, not just arms.</w:t>
             </w:r>
           </w:p>
         </w:tc>
@@ -2104,7 +2117,7 @@
                 <w:color w:val="2C2C2C"/>
                 <w:sz w:val="20"/>
               </w:rPr>
-              <w:t>3x8-12</w:t>
+              <w:t>4x10</w:t>
             </w:r>
           </w:p>
         </w:tc>
@@ -2157,7 +2170,7 @@
                 <w:color w:val="2C2C2C"/>
                 <w:sz w:val="20"/>
               </w:rPr>
-              <w:t>Seated Cable Row</w:t>
+              <w:t>Dumbbell Rows (Single Arm)</w:t>
             </w:r>
           </w:p>
           <w:p>
@@ -2167,7 +2180,7 @@
                 <w:color w:val="27AE60"/>
                 <w:sz w:val="16"/>
               </w:rPr>
-              <w:t>↻ Alt: T-Bar Row Machine</w:t>
+              <w:t>↻ Alt: Machine Row (Single Arm)</w:t>
             </w:r>
           </w:p>
           <w:p>
@@ -2176,7 +2189,7 @@
                 <w:color w:val="95A5A6"/>
                 <w:sz w:val="16"/>
               </w:rPr>
-              <w:t>💡 Keep your torso stable, pull handle towards your lower abs.</w:t>
+              <w:t>💡 Keep your back flat, pull the dumbbell towards your hip.</w:t>
             </w:r>
           </w:p>
         </w:tc>
@@ -2193,7 +2206,7 @@
                 <w:color w:val="2C2C2C"/>
                 <w:sz w:val="20"/>
               </w:rPr>
-              <w:t>3x10-15</w:t>
+              <w:t>3x10-12 per arm</w:t>
             </w:r>
           </w:p>
         </w:tc>
@@ -2210,7 +2223,7 @@
                 <w:color w:val="2C2C2C"/>
                 <w:sz w:val="20"/>
               </w:rPr>
-              <w:t>75s</w:t>
+              <w:t>60s</w:t>
             </w:r>
           </w:p>
         </w:tc>
@@ -2247,7 +2260,7 @@
                 <w:color w:val="2C2C2C"/>
                 <w:sz w:val="20"/>
               </w:rPr>
-              <w:t>Dumbbell Bicep Curl</w:t>
+              <w:t>Face Pulls (Cable)</w:t>
             </w:r>
           </w:p>
           <w:p>
@@ -2257,7 +2270,7 @@
                 <w:color w:val="27AE60"/>
                 <w:sz w:val="16"/>
               </w:rPr>
-              <w:t>↻ Alt: Barbell Bicep Curl</w:t>
+              <w:t>↻ Alt: Band Face Pulls</w:t>
             </w:r>
           </w:p>
           <w:p>
@@ -2266,7 +2279,7 @@
                 <w:color w:val="95A5A6"/>
                 <w:sz w:val="16"/>
               </w:rPr>
-              <w:t>💡 Keep elbows tucked in, control the eccentric phase.</w:t>
+              <w:t>💡 Focus on external rotation and pulling towards your face, targeting rear delts and upper back.</w:t>
             </w:r>
           </w:p>
         </w:tc>
@@ -2284,7 +2297,7 @@
                 <w:color w:val="2C2C2C"/>
                 <w:sz w:val="20"/>
               </w:rPr>
-              <w:t>3x10-15</w:t>
+              <w:t>3x15</w:t>
             </w:r>
           </w:p>
         </w:tc>
@@ -2337,7 +2350,7 @@
                 <w:color w:val="2C2C2C"/>
                 <w:sz w:val="20"/>
               </w:rPr>
-              <w:t>Hammer Curl</w:t>
+              <w:t>Back Extensions (Hyperextensions)</w:t>
             </w:r>
           </w:p>
           <w:p>
@@ -2347,7 +2360,7 @@
                 <w:color w:val="27AE60"/>
                 <w:sz w:val="16"/>
               </w:rPr>
-              <w:t>↻ Alt: Cable Hammer Curl</w:t>
+              <w:t>↻ Alt: Good Mornings (light weight)</w:t>
             </w:r>
           </w:p>
           <w:p>
@@ -2356,7 +2369,7 @@
                 <w:color w:val="95A5A6"/>
                 <w:sz w:val="16"/>
               </w:rPr>
-              <w:t>💡 Thumbs pointing up, target the brachialis and brachioradialis.</w:t>
+              <w:t>💡 Go slow and controlled, engaging lower back and glutes.</w:t>
             </w:r>
           </w:p>
         </w:tc>
@@ -2373,7 +2386,7 @@
                 <w:color w:val="2C2C2C"/>
                 <w:sz w:val="20"/>
               </w:rPr>
-              <w:t>3x12-15</w:t>
+              <w:t>3x15</w:t>
             </w:r>
           </w:p>
         </w:tc>
@@ -2427,7 +2440,7 @@
                 <w:color w:val="2980B9"/>
                 <w:sz w:val="26"/>
               </w:rPr>
-              <w:t xml:space="preserve">  Wednesday  —  Legs &amp; Core</w:t>
+              <w:t xml:space="preserve">  Wednesday  —  Legs  (Quads, hamstrings, glutes, calves)</w:t>
             </w:r>
           </w:p>
         </w:tc>
@@ -2561,7 +2574,7 @@
                 <w:color w:val="2C2C2C"/>
                 <w:sz w:val="20"/>
               </w:rPr>
-              <w:t>Barbell Back Squat</w:t>
+              <w:t>Barbell Squats</w:t>
             </w:r>
           </w:p>
           <w:p>
@@ -2580,7 +2593,7 @@
                 <w:color w:val="95A5A6"/>
                 <w:sz w:val="16"/>
               </w:rPr>
-              <w:t>💡 Focus on depth, keep chest up and core braced.</w:t>
+              <w:t>💡 Keep your chest up, go to at least parallel, and drive through your heels.</w:t>
             </w:r>
           </w:p>
         </w:tc>
@@ -2597,7 +2610,7 @@
                 <w:color w:val="2C2C2C"/>
                 <w:sz w:val="20"/>
               </w:rPr>
-              <w:t>4x6-10</w:t>
+              <w:t>4x8</w:t>
             </w:r>
           </w:p>
         </w:tc>
@@ -2651,7 +2664,7 @@
                 <w:color w:val="2C2C2C"/>
                 <w:sz w:val="20"/>
               </w:rPr>
-              <w:t>Romanian Deadlift (Dumbbell)</w:t>
+              <w:t>Romanian Deadlifts (Dumbbells)</w:t>
             </w:r>
           </w:p>
           <w:p>
@@ -2661,7 +2674,7 @@
                 <w:color w:val="27AE60"/>
                 <w:sz w:val="16"/>
               </w:rPr>
-              <w:t>↻ Alt: Good Mornings</w:t>
+              <w:t>↻ Alt: Glute-Ham Raise</w:t>
             </w:r>
           </w:p>
           <w:p>
@@ -2670,7 +2683,7 @@
                 <w:color w:val="95A5A6"/>
                 <w:sz w:val="16"/>
               </w:rPr>
-              <w:t>💡 Hinge at the hips, feel the stretch in your hamstrings.</w:t>
+              <w:t>💡 Maintain a slight bend in knees, hinge at hips, feel stretch in hamstrings.</w:t>
             </w:r>
           </w:p>
         </w:tc>
@@ -2688,7 +2701,7 @@
                 <w:color w:val="2C2C2C"/>
                 <w:sz w:val="20"/>
               </w:rPr>
-              <w:t>3x10-15</w:t>
+              <w:t>4x10</w:t>
             </w:r>
           </w:p>
         </w:tc>
@@ -2741,7 +2754,7 @@
                 <w:color w:val="2C2C2C"/>
                 <w:sz w:val="20"/>
               </w:rPr>
-              <w:t>Leg Extension</w:t>
+              <w:t>Leg Extension Machine</w:t>
             </w:r>
           </w:p>
           <w:p>
@@ -2751,7 +2764,7 @@
                 <w:color w:val="27AE60"/>
                 <w:sz w:val="16"/>
               </w:rPr>
-              <w:t>↻ Alt: Goblet Squat (lighter weight, higher reps)</w:t>
+              <w:t>↻ Alt: Sissy Squats (Bodyweight)</w:t>
             </w:r>
           </w:p>
           <w:p>
@@ -2760,7 +2773,7 @@
                 <w:color w:val="95A5A6"/>
                 <w:sz w:val="16"/>
               </w:rPr>
-              <w:t>💡 Squeeze quadriceps at the top, controlled movement.</w:t>
+              <w:t>💡 Focus on squeezing the quads at the top of the movement.</w:t>
             </w:r>
           </w:p>
         </w:tc>
@@ -2831,7 +2844,7 @@
                 <w:color w:val="2C2C2C"/>
                 <w:sz w:val="20"/>
               </w:rPr>
-              <w:t>Standing Calf Raise (Machine)</w:t>
+              <w:t>Leg Curl Machine</w:t>
             </w:r>
           </w:p>
           <w:p>
@@ -2841,7 +2854,7 @@
                 <w:color w:val="27AE60"/>
                 <w:sz w:val="16"/>
               </w:rPr>
-              <w:t>↻ Alt: Seated Calf Raise</w:t>
+              <w:t>↻ Alt: Dumbbell Hamstring Curl (Lying)</w:t>
             </w:r>
           </w:p>
           <w:p>
@@ -2850,7 +2863,7 @@
                 <w:color w:val="95A5A6"/>
                 <w:sz w:val="16"/>
               </w:rPr>
-              <w:t>💡 Full stretch at the bottom, explosively push up onto toes.</w:t>
+              <w:t>💡 Curl the weight slowly, feeling the hamstring contraction.</w:t>
             </w:r>
           </w:p>
         </w:tc>
@@ -2868,7 +2881,7 @@
                 <w:color w:val="2C2C2C"/>
                 <w:sz w:val="20"/>
               </w:rPr>
-              <w:t>3x15-20</w:t>
+              <w:t>3x12-15</w:t>
             </w:r>
           </w:p>
         </w:tc>
@@ -2886,7 +2899,7 @@
                 <w:color w:val="2C2C2C"/>
                 <w:sz w:val="20"/>
               </w:rPr>
-              <w:t>45s</w:t>
+              <w:t>60s</w:t>
             </w:r>
           </w:p>
         </w:tc>
@@ -2921,7 +2934,7 @@
                 <w:color w:val="2C2C2C"/>
                 <w:sz w:val="20"/>
               </w:rPr>
-              <w:t>Plank</w:t>
+              <w:t>Standing Calf Raises (Machine or Dumbbell)</w:t>
             </w:r>
           </w:p>
           <w:p>
@@ -2931,7 +2944,7 @@
                 <w:color w:val="27AE60"/>
                 <w:sz w:val="16"/>
               </w:rPr>
-              <w:t>↻ Alt: Side Plank</w:t>
+              <w:t>↻ Alt: Seated Calf Raises</w:t>
             </w:r>
           </w:p>
           <w:p>
@@ -2940,7 +2953,7 @@
                 <w:color w:val="95A5A6"/>
                 <w:sz w:val="16"/>
               </w:rPr>
-              <w:t>💡 Keep body in a straight line, engage glutes and core.</w:t>
+              <w:t>💡 Full range of motion, stretch at the bottom, squeeze at the top.</w:t>
             </w:r>
           </w:p>
         </w:tc>
@@ -2957,7 +2970,7 @@
                 <w:color w:val="2C2C2C"/>
                 <w:sz w:val="20"/>
               </w:rPr>
-              <w:t>3x30-60s hold</w:t>
+              <w:t>4x15-20</w:t>
             </w:r>
           </w:p>
         </w:tc>
@@ -3011,7 +3024,7 @@
                 <w:color w:val="2980B9"/>
                 <w:sz w:val="26"/>
               </w:rPr>
-              <w:t xml:space="preserve">  Thursday  —  Shoulders &amp; Traps</w:t>
+              <w:t xml:space="preserve">  Thursday  —  Shoulders  (All three delt heads — front, lateral, rear)</w:t>
             </w:r>
           </w:p>
         </w:tc>
@@ -3145,7 +3158,7 @@
                 <w:color w:val="2C2C2C"/>
                 <w:sz w:val="20"/>
               </w:rPr>
-              <w:t>Overhead Press (Barbell)</w:t>
+              <w:t>Dumbbell Shoulder Press (Seated)</w:t>
             </w:r>
           </w:p>
           <w:p>
@@ -3155,7 +3168,7 @@
                 <w:color w:val="27AE60"/>
                 <w:sz w:val="16"/>
               </w:rPr>
-              <w:t>↻ Alt: Dumbbell Shoulder Press</w:t>
+              <w:t>↻ Alt: Barbell Overhead Press (Standing)</w:t>
             </w:r>
           </w:p>
           <w:p>
@@ -3164,7 +3177,7 @@
                 <w:color w:val="95A5A6"/>
                 <w:sz w:val="16"/>
               </w:rPr>
-              <w:t>💡 Press vertically, avoid leaning back excessively.</w:t>
+              <w:t>💡 Press directly overhead, avoiding excessive arch in your lower back.</w:t>
             </w:r>
           </w:p>
         </w:tc>
@@ -3181,7 +3194,7 @@
                 <w:color w:val="2C2C2C"/>
                 <w:sz w:val="20"/>
               </w:rPr>
-              <w:t>4x8-12</w:t>
+              <w:t>4x8</w:t>
             </w:r>
           </w:p>
         </w:tc>
@@ -3235,7 +3248,7 @@
                 <w:color w:val="2C2C2C"/>
                 <w:sz w:val="20"/>
               </w:rPr>
-              <w:t>Dumbbell Lateral Raise</w:t>
+              <w:t>Lateral Raises (Dumbbell)</w:t>
             </w:r>
           </w:p>
           <w:p>
@@ -3245,7 +3258,7 @@
                 <w:color w:val="27AE60"/>
                 <w:sz w:val="16"/>
               </w:rPr>
-              <w:t>↻ Alt: Cable Lateral Raise</w:t>
+              <w:t>↻ Alt: Cable Lateral Raises</w:t>
             </w:r>
           </w:p>
           <w:p>
@@ -3254,7 +3267,7 @@
                 <w:color w:val="95A5A6"/>
                 <w:sz w:val="16"/>
               </w:rPr>
-              <w:t>💡 Lead with elbows, slight bend in arms, focus on side deltoids.</w:t>
+              <w:t>💡 Lead with your elbows, lift only to shoulder height, focus on side delts.</w:t>
             </w:r>
           </w:p>
         </w:tc>
@@ -3272,7 +3285,7 @@
                 <w:color w:val="2C2C2C"/>
                 <w:sz w:val="20"/>
               </w:rPr>
-              <w:t>3x12-15</w:t>
+              <w:t>4x12-15</w:t>
             </w:r>
           </w:p>
         </w:tc>
@@ -3325,7 +3338,7 @@
                 <w:color w:val="2C2C2C"/>
                 <w:sz w:val="20"/>
               </w:rPr>
-              <w:t>Face Pulls (Rope Attachment)</w:t>
+              <w:t>Front Raises (Plate or Dumbbell)</w:t>
             </w:r>
           </w:p>
           <w:p>
@@ -3335,7 +3348,7 @@
                 <w:color w:val="27AE60"/>
                 <w:sz w:val="16"/>
               </w:rPr>
-              <w:t>↻ Alt: Reverse Pec Deck Fly</w:t>
+              <w:t>↻ Alt: Machine Shoulder Press (front focus)</w:t>
             </w:r>
           </w:p>
           <w:p>
@@ -3344,7 +3357,7 @@
                 <w:color w:val="95A5A6"/>
                 <w:sz w:val="16"/>
               </w:rPr>
-              <w:t>💡 Pull towards your face, externally rotate shoulders.</w:t>
+              <w:t>💡 Control the weight, don't swing; lift to shoulder height.</w:t>
             </w:r>
           </w:p>
         </w:tc>
@@ -3361,7 +3374,7 @@
                 <w:color w:val="2C2C2C"/>
                 <w:sz w:val="20"/>
               </w:rPr>
-              <w:t>3x15-20</w:t>
+              <w:t>3x12</w:t>
             </w:r>
           </w:p>
         </w:tc>
@@ -3415,7 +3428,7 @@
                 <w:color w:val="2C2C2C"/>
                 <w:sz w:val="20"/>
               </w:rPr>
-              <w:t>Dumbbell Front Raise</w:t>
+              <w:t>Reverse Pec Deck Fly</w:t>
             </w:r>
           </w:p>
           <w:p>
@@ -3425,7 +3438,7 @@
                 <w:color w:val="27AE60"/>
                 <w:sz w:val="16"/>
               </w:rPr>
-              <w:t>↻ Alt: Barbell Front Raise</w:t>
+              <w:t>↻ Alt: Bent-Over Dumbbell Rear Delt Fly</w:t>
             </w:r>
           </w:p>
           <w:p>
@@ -3434,7 +3447,7 @@
                 <w:color w:val="95A5A6"/>
                 <w:sz w:val="16"/>
               </w:rPr>
-              <w:t>💡 Raise to shoulder height, controlled movement.</w:t>
+              <w:t>💡 Focus on pulling with your rear delts, not your back, keeping a slight bend in your elbows.</w:t>
             </w:r>
           </w:p>
         </w:tc>
@@ -3452,7 +3465,7 @@
                 <w:color w:val="2C2C2C"/>
                 <w:sz w:val="20"/>
               </w:rPr>
-              <w:t>3x10-15</w:t>
+              <w:t>3x15</w:t>
             </w:r>
           </w:p>
         </w:tc>
@@ -3524,7 +3537,7 @@
                 <w:color w:val="95A5A6"/>
                 <w:sz w:val="16"/>
               </w:rPr>
-              <w:t>💡 Focus on elevating shoulders straight up, squeeze traps at the top.</w:t>
+              <w:t>💡 Lift your shoulders straight up towards your ears, hold briefly, then lower slowly.</w:t>
             </w:r>
           </w:p>
         </w:tc>
@@ -3541,7 +3554,7 @@
                 <w:color w:val="2C2C2C"/>
                 <w:sz w:val="20"/>
               </w:rPr>
-              <w:t>3x12-15</w:t>
+              <w:t>3x15</w:t>
             </w:r>
           </w:p>
         </w:tc>
@@ -3595,7 +3608,7 @@
                 <w:color w:val="2980B9"/>
                 <w:sz w:val="26"/>
               </w:rPr>
-              <w:t xml:space="preserve">  Friday  —  Full Body Compound Focus</w:t>
+              <w:t xml:space="preserve">  Friday  —  Arms  (Biceps + triceps — antagonist supersets encouraged)</w:t>
             </w:r>
           </w:p>
         </w:tc>
@@ -3729,7 +3742,7 @@
                 <w:color w:val="2C2C2C"/>
                 <w:sz w:val="20"/>
               </w:rPr>
-              <w:t>Deadlifts (Conventional or Sumo)</w:t>
+              <w:t>Superset: Barbell Bicep Curls + Close Grip Bench Press</w:t>
             </w:r>
           </w:p>
           <w:p>
@@ -3739,7 +3752,7 @@
                 <w:color w:val="27AE60"/>
                 <w:sz w:val="16"/>
               </w:rPr>
-              <w:t>↻ Alt: Trap Bar Deadlifts</w:t>
+              <w:t>↻ Alt: Superset: EZ Bar Curls + Decline Dumbbell Triceps Extension</w:t>
             </w:r>
           </w:p>
           <w:p>
@@ -3748,7 +3761,7 @@
                 <w:color w:val="95A5A6"/>
                 <w:sz w:val="16"/>
               </w:rPr>
-              <w:t>💡 Prioritize perfect form, lighter weight if new to the movement.</w:t>
+              <w:t>💡 For curls, keep elbows tucked; for bench press, keep elbows close to body.</w:t>
             </w:r>
           </w:p>
         </w:tc>
@@ -3765,7 +3778,7 @@
                 <w:color w:val="2C2C2C"/>
                 <w:sz w:val="20"/>
               </w:rPr>
-              <w:t>3x5-8</w:t>
+              <w:t>4x10-12 for each</w:t>
             </w:r>
           </w:p>
         </w:tc>
@@ -3782,7 +3795,7 @@
                 <w:color w:val="2C2C2C"/>
                 <w:sz w:val="20"/>
               </w:rPr>
-              <w:t>120s</w:t>
+              <w:t>90s after superset</w:t>
             </w:r>
           </w:p>
         </w:tc>
@@ -3819,7 +3832,7 @@
                 <w:color w:val="2C2C2C"/>
                 <w:sz w:val="20"/>
               </w:rPr>
-              <w:t>Dumbbell Bench Press</w:t>
+              <w:t>Superset: Dumbbell Hammer Curls + Overhead Dumbbell Triceps Extension</w:t>
             </w:r>
           </w:p>
           <w:p>
@@ -3829,7 +3842,7 @@
                 <w:color w:val="27AE60"/>
                 <w:sz w:val="16"/>
               </w:rPr>
-              <w:t>↻ Alt: Machine Chest Press</w:t>
+              <w:t>↻ Alt: Superset: Incline Dumbbell Curls + Cable Overhead Triceps Extension</w:t>
             </w:r>
           </w:p>
           <w:p>
@@ -3838,7 +3851,7 @@
                 <w:color w:val="95A5A6"/>
                 <w:sz w:val="16"/>
               </w:rPr>
-              <w:t>💡 Ensure full stretch at the bottom, controlled press.</w:t>
+              <w:t>💡 For hammer curls, neutral grip; for overhead, keep elbows in.</w:t>
             </w:r>
           </w:p>
         </w:tc>
@@ -3856,7 +3869,7 @@
                 <w:color w:val="2C2C2C"/>
                 <w:sz w:val="20"/>
               </w:rPr>
-              <w:t>3x10-15</w:t>
+              <w:t>3x12-15 for each</w:t>
             </w:r>
           </w:p>
         </w:tc>
@@ -3874,7 +3887,7 @@
                 <w:color w:val="2C2C2C"/>
                 <w:sz w:val="20"/>
               </w:rPr>
-              <w:t>90s</w:t>
+              <w:t>60s after superset</w:t>
             </w:r>
           </w:p>
         </w:tc>
@@ -3909,7 +3922,7 @@
                 <w:color w:val="2C2C2C"/>
                 <w:sz w:val="20"/>
               </w:rPr>
-              <w:t>Pull-ups (or Lat Pulldown if not proficient)</w:t>
+              <w:t>Superset: Cable Bicep Curls + Triceps Rope Pushdown</w:t>
             </w:r>
           </w:p>
           <w:p>
@@ -3919,7 +3932,7 @@
                 <w:color w:val="27AE60"/>
                 <w:sz w:val="16"/>
               </w:rPr>
-              <w:t>↻ Alt: Machine Assisted Pull-ups</w:t>
+              <w:t>↻ Alt: Superset: Concentration Curls + Triceps Kickbacks</w:t>
             </w:r>
           </w:p>
           <w:p>
@@ -3928,7 +3941,7 @@
                 <w:color w:val="95A5A6"/>
                 <w:sz w:val="16"/>
               </w:rPr>
-              <w:t>💡 Focus on engaging your lats, aim for controlled descent.</w:t>
+              <w:t>💡 Focus on peak contraction for both movements, control the negative.</w:t>
             </w:r>
           </w:p>
         </w:tc>
@@ -3945,7 +3958,7 @@
                 <w:color w:val="2C2C2C"/>
                 <w:sz w:val="20"/>
               </w:rPr>
-              <w:t>3xAMRAP / 3x10-12</w:t>
+              <w:t>3x15 for each</w:t>
             </w:r>
           </w:p>
         </w:tc>
@@ -3962,7 +3975,411 @@
                 <w:color w:val="2C2C2C"/>
                 <w:sz w:val="20"/>
               </w:rPr>
-              <w:t>90s</w:t>
+              <w:t>60s after superset</w:t>
+            </w:r>
+          </w:p>
+        </w:tc>
+      </w:tr>
+    </w:tbl>
+    <w:p/>
+    <w:tbl>
+      <w:tblPr>
+        <w:tblW w:type="auto" w:w="0"/>
+        <w:jc w:val="center"/>
+        <w:tblLook w:firstColumn="1" w:firstRow="1" w:lastColumn="0" w:lastRow="0" w:noHBand="0" w:noVBand="1" w:val="04A0"/>
+        <w:tblBorders>
+          <w:top w:val="single" w:sz="4" w:space="0" w:color="DDDDDD"/>
+          <w:left w:val="single" w:sz="4" w:space="0" w:color="DDDDDD"/>
+          <w:bottom w:val="single" w:sz="4" w:space="0" w:color="DDDDDD"/>
+          <w:right w:val="single" w:sz="4" w:space="0" w:color="DDDDDD"/>
+          <w:insideH w:val="single" w:sz="4" w:space="0" w:color="DDDDDD"/>
+          <w:insideV w:val="single" w:sz="4" w:space="0" w:color="DDDDDD"/>
+        </w:tblBorders>
+      </w:tblPr>
+      <w:tblGrid>
+        <w:gridCol w:w="10200"/>
+      </w:tblGrid>
+      <w:tr>
+        <w:tc>
+          <w:tcPr>
+            <w:tcW w:type="dxa" w:w="10200"/>
+            <w:shd w:fill="EBF5FB"/>
+          </w:tcPr>
+          <w:p>
+            <w:r>
+              <w:rPr>
+                <w:b/>
+                <w:color w:val="2980B9"/>
+                <w:sz w:val="26"/>
+              </w:rPr>
+              <w:t xml:space="preserve">  Saturday  —  Core + Cardio  (Abs, obliques, cardiovascular base)</w:t>
+            </w:r>
+          </w:p>
+        </w:tc>
+      </w:tr>
+    </w:tbl>
+    <w:tbl>
+      <w:tblPr>
+        <w:tblW w:type="auto" w:w="0"/>
+        <w:jc w:val="center"/>
+        <w:tblLook w:firstColumn="1" w:firstRow="1" w:lastColumn="0" w:lastRow="0" w:noHBand="0" w:noVBand="1" w:val="04A0"/>
+        <w:tblBorders>
+          <w:top w:val="single" w:sz="4" w:space="0" w:color="DDDDDD"/>
+          <w:left w:val="single" w:sz="4" w:space="0" w:color="DDDDDD"/>
+          <w:bottom w:val="single" w:sz="4" w:space="0" w:color="DDDDDD"/>
+          <w:right w:val="single" w:sz="4" w:space="0" w:color="DDDDDD"/>
+          <w:insideH w:val="single" w:sz="4" w:space="0" w:color="DDDDDD"/>
+          <w:insideV w:val="single" w:sz="4" w:space="0" w:color="DDDDDD"/>
+        </w:tblBorders>
+      </w:tblPr>
+      <w:tblGrid>
+        <w:gridCol w:w="2550"/>
+        <w:gridCol w:w="2550"/>
+        <w:gridCol w:w="2550"/>
+        <w:gridCol w:w="2550"/>
+      </w:tblGrid>
+      <w:tr>
+        <w:tc>
+          <w:tcPr>
+            <w:tcW w:type="dxa" w:w="2550"/>
+            <w:shd w:fill="2980B9"/>
+          </w:tcPr>
+          <w:p>
+            <w:pPr>
+              <w:jc w:val="center"/>
+            </w:pPr>
+            <w:r>
+              <w:rPr>
+                <w:b/>
+                <w:color w:val="FFFFFF"/>
+                <w:sz w:val="18"/>
+              </w:rPr>
+              <w:t>#</w:t>
+            </w:r>
+          </w:p>
+        </w:tc>
+        <w:tc>
+          <w:tcPr>
+            <w:tcW w:type="dxa" w:w="2550"/>
+            <w:shd w:fill="2980B9"/>
+          </w:tcPr>
+          <w:p>
+            <w:pPr>
+              <w:jc w:val="center"/>
+            </w:pPr>
+            <w:r>
+              <w:rPr>
+                <w:b/>
+                <w:color w:val="FFFFFF"/>
+                <w:sz w:val="18"/>
+              </w:rPr>
+              <w:t>Exercise</w:t>
+            </w:r>
+          </w:p>
+        </w:tc>
+        <w:tc>
+          <w:tcPr>
+            <w:tcW w:type="dxa" w:w="2550"/>
+            <w:shd w:fill="2980B9"/>
+          </w:tcPr>
+          <w:p>
+            <w:pPr>
+              <w:jc w:val="center"/>
+            </w:pPr>
+            <w:r>
+              <w:rPr>
+                <w:b/>
+                <w:color w:val="FFFFFF"/>
+                <w:sz w:val="18"/>
+              </w:rPr>
+              <w:t>Sets × Reps</w:t>
+            </w:r>
+          </w:p>
+        </w:tc>
+        <w:tc>
+          <w:tcPr>
+            <w:tcW w:type="dxa" w:w="2550"/>
+            <w:shd w:fill="2980B9"/>
+          </w:tcPr>
+          <w:p>
+            <w:pPr>
+              <w:jc w:val="center"/>
+            </w:pPr>
+            <w:r>
+              <w:rPr>
+                <w:b/>
+                <w:color w:val="FFFFFF"/>
+                <w:sz w:val="18"/>
+              </w:rPr>
+              <w:t>Rest</w:t>
+            </w:r>
+          </w:p>
+        </w:tc>
+      </w:tr>
+      <w:tr>
+        <w:tc>
+          <w:tcPr>
+            <w:tcW w:type="dxa" w:w="2550"/>
+          </w:tcPr>
+          <w:p>
+            <w:pPr>
+              <w:jc w:val="center"/>
+            </w:pPr>
+            <w:r>
+              <w:rPr>
+                <w:b/>
+                <w:color w:val="2980B9"/>
+                <w:sz w:val="20"/>
+              </w:rPr>
+              <w:t>1</w:t>
+            </w:r>
+          </w:p>
+        </w:tc>
+        <w:tc>
+          <w:tcPr>
+            <w:tcW w:type="dxa" w:w="2550"/>
+          </w:tcPr>
+          <w:p>
+            <w:r>
+              <w:rPr>
+                <w:b/>
+                <w:color w:val="2C2C2C"/>
+                <w:sz w:val="20"/>
+              </w:rPr>
+              <w:t>Plank</w:t>
+            </w:r>
+          </w:p>
+          <w:p>
+            <w:r>
+              <w:rPr>
+                <w:i/>
+                <w:color w:val="27AE60"/>
+                <w:sz w:val="16"/>
+              </w:rPr>
+              <w:t>↻ Alt: Side Plank (3x30s per side)</w:t>
+            </w:r>
+          </w:p>
+          <w:p>
+            <w:r>
+              <w:rPr>
+                <w:color w:val="95A5A6"/>
+                <w:sz w:val="16"/>
+              </w:rPr>
+              <w:t>💡 Keep your body in a straight line from head to heels, core braced.</w:t>
+            </w:r>
+          </w:p>
+        </w:tc>
+        <w:tc>
+          <w:tcPr>
+            <w:tcW w:type="dxa" w:w="2550"/>
+          </w:tcPr>
+          <w:p>
+            <w:pPr>
+              <w:jc w:val="center"/>
+            </w:pPr>
+            <w:r>
+              <w:rPr>
+                <w:color w:val="2C2C2C"/>
+                <w:sz w:val="20"/>
+              </w:rPr>
+              <w:t>3x60s hold</w:t>
+            </w:r>
+          </w:p>
+        </w:tc>
+        <w:tc>
+          <w:tcPr>
+            <w:tcW w:type="dxa" w:w="2550"/>
+          </w:tcPr>
+          <w:p>
+            <w:pPr>
+              <w:jc w:val="center"/>
+            </w:pPr>
+            <w:r>
+              <w:rPr>
+                <w:color w:val="2C2C2C"/>
+                <w:sz w:val="20"/>
+              </w:rPr>
+              <w:t>60s</w:t>
+            </w:r>
+          </w:p>
+        </w:tc>
+      </w:tr>
+      <w:tr>
+        <w:tc>
+          <w:tcPr>
+            <w:tcW w:type="dxa" w:w="2550"/>
+            <w:shd w:fill="F8F9FA"/>
+          </w:tcPr>
+          <w:p>
+            <w:pPr>
+              <w:jc w:val="center"/>
+            </w:pPr>
+            <w:r>
+              <w:rPr>
+                <w:b/>
+                <w:color w:val="2980B9"/>
+                <w:sz w:val="20"/>
+              </w:rPr>
+              <w:t>2</w:t>
+            </w:r>
+          </w:p>
+        </w:tc>
+        <w:tc>
+          <w:tcPr>
+            <w:tcW w:type="dxa" w:w="2550"/>
+            <w:shd w:fill="F8F9FA"/>
+          </w:tcPr>
+          <w:p>
+            <w:r>
+              <w:rPr>
+                <w:b/>
+                <w:color w:val="2C2C2C"/>
+                <w:sz w:val="20"/>
+              </w:rPr>
+              <w:t>Russian Twists (Weighted if possible)</w:t>
+            </w:r>
+          </w:p>
+          <w:p>
+            <w:r>
+              <w:rPr>
+                <w:i/>
+                <w:color w:val="27AE60"/>
+                <w:sz w:val="16"/>
+              </w:rPr>
+              <w:t>↻ Alt: Cable Wood Chops (light weight)</w:t>
+            </w:r>
+          </w:p>
+          <w:p>
+            <w:r>
+              <w:rPr>
+                <w:color w:val="95A5A6"/>
+                <w:sz w:val="16"/>
+              </w:rPr>
+              <w:t>💡 Engage your obliques, keep your feet off the ground for more challenge.</w:t>
+            </w:r>
+          </w:p>
+        </w:tc>
+        <w:tc>
+          <w:tcPr>
+            <w:tcW w:type="dxa" w:w="2550"/>
+            <w:shd w:fill="F8F9FA"/>
+          </w:tcPr>
+          <w:p>
+            <w:pPr>
+              <w:jc w:val="center"/>
+            </w:pPr>
+            <w:r>
+              <w:rPr>
+                <w:color w:val="2C2C2C"/>
+                <w:sz w:val="20"/>
+              </w:rPr>
+              <w:t>3x15-20 per side</w:t>
+            </w:r>
+          </w:p>
+        </w:tc>
+        <w:tc>
+          <w:tcPr>
+            <w:tcW w:type="dxa" w:w="2550"/>
+            <w:shd w:fill="F8F9FA"/>
+          </w:tcPr>
+          <w:p>
+            <w:pPr>
+              <w:jc w:val="center"/>
+            </w:pPr>
+            <w:r>
+              <w:rPr>
+                <w:color w:val="2C2C2C"/>
+                <w:sz w:val="20"/>
+              </w:rPr>
+              <w:t>60s</w:t>
+            </w:r>
+          </w:p>
+        </w:tc>
+      </w:tr>
+      <w:tr>
+        <w:tc>
+          <w:tcPr>
+            <w:tcW w:type="dxa" w:w="2550"/>
+          </w:tcPr>
+          <w:p>
+            <w:pPr>
+              <w:jc w:val="center"/>
+            </w:pPr>
+            <w:r>
+              <w:rPr>
+                <w:b/>
+                <w:color w:val="2980B9"/>
+                <w:sz w:val="20"/>
+              </w:rPr>
+              <w:t>3</w:t>
+            </w:r>
+          </w:p>
+        </w:tc>
+        <w:tc>
+          <w:tcPr>
+            <w:tcW w:type="dxa" w:w="2550"/>
+          </w:tcPr>
+          <w:p>
+            <w:r>
+              <w:rPr>
+                <w:b/>
+                <w:color w:val="2C2C2C"/>
+                <w:sz w:val="20"/>
+              </w:rPr>
+              <w:t>Cable Crunches</w:t>
+            </w:r>
+          </w:p>
+          <w:p>
+            <w:r>
+              <w:rPr>
+                <w:i/>
+                <w:color w:val="27AE60"/>
+                <w:sz w:val="16"/>
+              </w:rPr>
+              <w:t>↻ Alt: Machine Crunches</w:t>
+            </w:r>
+          </w:p>
+          <w:p>
+            <w:r>
+              <w:rPr>
+                <w:color w:val="95A5A6"/>
+                <w:sz w:val="16"/>
+              </w:rPr>
+              <w:t>💡 Crunch your torso downwards, feeling the abs contract, not just pulling with arms.</w:t>
+            </w:r>
+          </w:p>
+        </w:tc>
+        <w:tc>
+          <w:tcPr>
+            <w:tcW w:type="dxa" w:w="2550"/>
+          </w:tcPr>
+          <w:p>
+            <w:pPr>
+              <w:jc w:val="center"/>
+            </w:pPr>
+            <w:r>
+              <w:rPr>
+                <w:color w:val="2C2C2C"/>
+                <w:sz w:val="20"/>
+              </w:rPr>
+              <w:t>3x15</w:t>
+            </w:r>
+          </w:p>
+        </w:tc>
+        <w:tc>
+          <w:tcPr>
+            <w:tcW w:type="dxa" w:w="2550"/>
+          </w:tcPr>
+          <w:p>
+            <w:pPr>
+              <w:jc w:val="center"/>
+            </w:pPr>
+            <w:r>
+              <w:rPr>
+                <w:color w:val="2C2C2C"/>
+                <w:sz w:val="20"/>
+              </w:rPr>
+              <w:t>60s</w:t>
             </w:r>
           </w:p>
         </w:tc>
@@ -3999,7 +4416,7 @@
                 <w:color w:val="2C2C2C"/>
                 <w:sz w:val="20"/>
               </w:rPr>
-              <w:t>Goblet Squat</w:t>
+              <w:t>Leg Raises (Lying)</w:t>
             </w:r>
           </w:p>
           <w:p>
@@ -4009,7 +4426,7 @@
                 <w:color w:val="27AE60"/>
                 <w:sz w:val="16"/>
               </w:rPr>
-              <w:t>↻ Alt: Bodyweight Squat (with tempo)</w:t>
+              <w:t>↻ Alt: Hanging Leg Raises (knee tucks if too difficult)</w:t>
             </w:r>
           </w:p>
           <w:p>
@@ -4018,7 +4435,7 @@
                 <w:color w:val="95A5A6"/>
                 <w:sz w:val="16"/>
               </w:rPr>
-              <w:t>💡 Keep chest up, drive through heels, focus on core engagement.</w:t>
+              <w:t>💡 Keep your lower back pressed into the floor throughout the movement.</w:t>
             </w:r>
           </w:p>
         </w:tc>
@@ -4036,7 +4453,7 @@
                 <w:color w:val="2C2C2C"/>
                 <w:sz w:val="20"/>
               </w:rPr>
-              <w:t>3x12-15</w:t>
+              <w:t>3x15-20</w:t>
             </w:r>
           </w:p>
         </w:tc>
@@ -4054,7 +4471,7 @@
                 <w:color w:val="2C2C2C"/>
                 <w:sz w:val="20"/>
               </w:rPr>
-              <w:t>75s</w:t>
+              <w:t>60s</w:t>
             </w:r>
           </w:p>
         </w:tc>
@@ -4089,7 +4506,7 @@
                 <w:color w:val="2C2C2C"/>
                 <w:sz w:val="20"/>
               </w:rPr>
-              <w:t>Push-ups</w:t>
+              <w:t>Brisk Walk or Light Jog</w:t>
             </w:r>
           </w:p>
           <w:p>
@@ -4099,7 +4516,7 @@
                 <w:color w:val="27AE60"/>
                 <w:sz w:val="16"/>
               </w:rPr>
-              <w:t>↻ Alt: Incline Push-ups</w:t>
+              <w:t>↻ Alt: Cycling or Elliptical</w:t>
             </w:r>
           </w:p>
           <w:p>
@@ -4108,7 +4525,7 @@
                 <w:color w:val="95A5A6"/>
                 <w:sz w:val="16"/>
               </w:rPr>
-              <w:t>💡 Maintain a straight body line from head to heels.</w:t>
+              <w:t>💡 Maintain a steady pace where you can talk but are slightly breathless.</w:t>
             </w:r>
           </w:p>
         </w:tc>
@@ -4125,7 +4542,7 @@
                 <w:color w:val="2C2C2C"/>
                 <w:sz w:val="20"/>
               </w:rPr>
-              <w:t>3xAMRAP</w:t>
+              <w:t>30-40 minutes</w:t>
             </w:r>
           </w:p>
         </w:tc>
@@ -4142,16 +4559,52 @@
                 <w:color w:val="2C2C2C"/>
                 <w:sz w:val="20"/>
               </w:rPr>
-              <w:t>60s</w:t>
+              <w:t>N/A</w:t>
             </w:r>
           </w:p>
         </w:tc>
       </w:tr>
     </w:tbl>
     <w:p/>
+    <w:tbl>
+      <w:tblPr>
+        <w:tblW w:type="auto" w:w="0"/>
+        <w:jc w:val="center"/>
+        <w:tblLook w:firstColumn="1" w:firstRow="1" w:lastColumn="0" w:lastRow="0" w:noHBand="0" w:noVBand="1" w:val="04A0"/>
+        <w:tblBorders>
+          <w:top w:val="single" w:sz="4" w:space="0" w:color="DDDDDD"/>
+          <w:left w:val="single" w:sz="4" w:space="0" w:color="DDDDDD"/>
+          <w:bottom w:val="single" w:sz="4" w:space="0" w:color="DDDDDD"/>
+          <w:right w:val="single" w:sz="4" w:space="0" w:color="DDDDDD"/>
+          <w:insideH w:val="single" w:sz="4" w:space="0" w:color="DDDDDD"/>
+          <w:insideV w:val="single" w:sz="4" w:space="0" w:color="DDDDDD"/>
+        </w:tblBorders>
+      </w:tblPr>
+      <w:tblGrid>
+        <w:gridCol w:w="10200"/>
+      </w:tblGrid>
+      <w:tr>
+        <w:tc>
+          <w:tcPr>
+            <w:tcW w:type="dxa" w:w="10200"/>
+            <w:shd w:fill="EBF5FB"/>
+          </w:tcPr>
+          <w:p>
+            <w:r>
+              <w:rPr>
+                <w:b/>
+                <w:color w:val="2980B9"/>
+                <w:sz w:val="26"/>
+              </w:rPr>
+              <w:t xml:space="preserve">  Sunday  —  Rest — Reward Yourself  (Active recovery, no gym)</w:t>
+            </w:r>
+          </w:p>
+        </w:tc>
+      </w:tr>
+    </w:tbl>
     <w:p>
       <w:pPr>
-        <w:spacing w:before="240"/>
+        <w:spacing w:before="120"/>
         <w:jc w:val="center"/>
       </w:pPr>
       <w:r>
@@ -4160,7 +4613,7 @@
           <w:color w:val="6C28D2"/>
           <w:sz w:val="22"/>
         </w:rPr>
-        <w:t>🧘 Saturday &amp; Sunday: Rest / Active Recovery (light walk, stretching, yoga)</w:t>
+        <w:t>🧘 Active recovery — light walk, stretching, yoga. No gym.</w:t>
       </w:r>
     </w:p>
     <w:p/>
@@ -4264,7 +4717,7 @@
                 <w:color w:val="2C2C2C"/>
                 <w:sz w:val="20"/>
               </w:rPr>
-              <w:t>Whey Protein: 1 scoop (24-30g protein) post-workout with water for rapid muscle repair and recovery.</w:t>
+              <w:t>Whey Protein: 1 scoop (approx. 25-30g protein) post-workout for muscle repair and recovery, or as a quick snack.</w:t>
             </w:r>
           </w:p>
         </w:tc>
@@ -4300,7 +4753,7 @@
                 <w:color w:val="2C2C2C"/>
                 <w:sz w:val="20"/>
               </w:rPr>
-              <w:t>Creatine Monohydrate: 5g daily (mixed with water or juice), taken at any time of day, to enhance strength, power, and muscle volume.</w:t>
+              <w:t>Creatine Monohydrate: 5g daily, mixed with water or your post-workout shake, to enhance strength, power, and muscle volume.</w:t>
             </w:r>
           </w:p>
         </w:tc>
@@ -4334,7 +4787,7 @@
                 <w:color w:val="2C2C2C"/>
                 <w:sz w:val="20"/>
               </w:rPr>
-              <w:t>Multivitamin: 1 serving daily with your largest meal to ensure adequate intake of essential micronutrients for overall health and performance.</w:t>
+              <w:t>Multivitamin: 1 serving daily with a meal to cover any potential micronutrient gaps and support overall health and energy levels.</w:t>
             </w:r>
           </w:p>
         </w:tc>
@@ -4370,7 +4823,7 @@
                 <w:color w:val="2C2C2C"/>
                 <w:sz w:val="20"/>
               </w:rPr>
-              <w:t>Omega-3 Fish Oil: 2-3g EPA/DHA combined daily (e.g., 2 softgels), with meals, to support joint health, reduce inflammation, and aid cardiovascular health.</w:t>
+              <w:t>Fish Oil (Omega-3s): 1-2g daily (EPA+DHA) with a meal, for inflammation reduction, heart health, and joint support, crucial for intense training.</w:t>
             </w:r>
           </w:p>
         </w:tc>
@@ -4406,7 +4859,7 @@
           <w:color w:val="2C2C2C"/>
           <w:sz w:val="20"/>
         </w:rPr>
-        <w:t>Integrate short movement breaks (5-10 minutes) every hour during your desk job to counteract prolonged sitting. This could include walking, stretching, or light bodyweight exercises.</w:t>
+        <w:t>Capitalize on your excellent sleep habits: continue prioritizing 8+ hours of quality sleep nightly to optimize muscle recovery and hormone production, which is crucial for growth.</w:t>
       </w:r>
     </w:p>
     <w:p>
@@ -4425,7 +4878,7 @@
           <w:color w:val="2C2C2C"/>
           <w:sz w:val="20"/>
         </w:rPr>
-        <w:t>Be mindful of late-night phone usage. Aim to put away your phone at least 30-60 minutes before bedtime to support excellent sleep quality, even though you already get ample sleep hours.</w:t>
+        <w:t>Integrate 'movement snacks' into your desk job routine; aim for 5-10 minutes of light walking or stretching every 60-90 minutes to break prolonged sitting.</w:t>
       </w:r>
     </w:p>
     <w:p>
@@ -4444,7 +4897,7 @@
           <w:color w:val="2C2C2C"/>
           <w:sz w:val="20"/>
         </w:rPr>
-        <w:t>Establish a consistent evening routine that signals to your body it's time to wind down. This could include reading, light stretching, or meditation to optimize sleep recovery.</w:t>
+        <w:t>Be mindful of late-night phone usage: while moderate, try to put your phone away at least 30-60 minutes before bed to support deeper, more restorative sleep.</w:t>
       </w:r>
     </w:p>
     <w:p>
@@ -4463,7 +4916,7 @@
           <w:color w:val="2C2C2C"/>
           <w:sz w:val="20"/>
         </w:rPr>
-        <w:t>Plan your workouts and food intake for the week ahead. Given your consistent schedule, this proactive approach will minimize stress and ensure you consistently hit your nutrition and training targets.</w:t>
+        <w:t>Maintain your low stress levels by regularly engaging in hobbies or relaxation techniques you enjoy, as chronic stress can hinder muscle gain and recovery.</w:t>
       </w:r>
     </w:p>
     <w:p>
@@ -4482,7 +4935,26 @@
           <w:color w:val="2C2C2C"/>
           <w:sz w:val="20"/>
         </w:rPr>
-        <w:t>Consider incorporating a 15-20 minute walk during your lunch break or after dinner. This gentle activity aids digestion and adds to your overall daily energy expenditure without impacting recovery.</w:t>
+        <w:t>Ensure consistent hydration throughout your workday by keeping a water bottle at your desk and sipping regularly, aiming for your 2.2L daily target.</w:t>
+      </w:r>
+    </w:p>
+    <w:p>
+      <w:pPr>
+        <w:spacing w:before="80" w:after="80"/>
+        <w:ind w:left="432"/>
+      </w:pPr>
+      <w:r>
+        <w:rPr>
+          <w:sz w:val="22"/>
+        </w:rPr>
+        <w:t xml:space="preserve">  🎯  </w:t>
+      </w:r>
+      <w:r>
+        <w:rPr>
+          <w:color w:val="2C2C2C"/>
+          <w:sz w:val="20"/>
+        </w:rPr>
+        <w:t>Incorporate light stretching or foam rolling on rest days to improve flexibility, reduce muscle soreness, and aid recovery.</w:t>
       </w:r>
     </w:p>
     <w:p/>

</xml_diff>